<commit_message>
Fix affirmative after side question resuming booking, update practitioners, and sync all local changes
- Fix: typing "okay", "cool", "got it" etc. after a side question during booking now
  resumes the current step instead of rejecting as invalid input
- Add side-question marker to rescheduling_policy handler for consistency
- Update practitioner roster and service mappings
- Add new KB sources (FAQ, fees, our story) and their creation scripts
- NLP and booking flow improvements

Co-Authored-By: Claude Opus 4.6 <noreply@anthropic.com>
</commit_message>
<xml_diff>
--- a/kb/sources/nova_clinic_kb.docx
+++ b/kb/sources/nova_clinic_kb.docx
@@ -16305,8 +16305,8 @@
           <w:szCs w:val="34"/>
         </w:rPr>
       </w:pPr>
-      <w:bookmarkStart w:colFirst="0" w:colLast="0" w:name="_dqb4s1dfjmpj" w:id="161"/>
-      <w:bookmarkEnd w:id="161"/>
+      <w:bookmarkStart w:colFirst="0" w:colLast="0" w:name="_h41gtkp4e86p" w:id="171"/>
+      <w:bookmarkEnd w:id="171"/>
       <w:r>
         <w:rPr>
           <w:b w:val="1"/>
@@ -16315,883 +16315,7 @@
           <w:szCs w:val="34"/>
           <w:rtl w:val="0"/>
         </w:rPr>
-        <w:t xml:space="preserve">3. PRACTITIONER: Dr. Chad Patterson, ND</w:t>
-      </w:r>
-    </w:p>
-    <w:p>
-      <w:pPr>
-        <w:pStyle w:val="Heading3"/>
-        <w:keepNext w:val="0"/>
-        <w:keepLines w:val="0"/>
-        <w:spacing w:before="280" w:lineRule="auto"/>
-        <w:rPr>
-          <w:b w:val="1"/>
-          <w:bCs w:val="1"/>
-          <w:color w:val="000000"/>
-          <w:sz w:val="26"/>
-          <w:szCs w:val="26"/>
-        </w:rPr>
-      </w:pPr>
-      <w:bookmarkStart w:colFirst="0" w:colLast="0" w:name="_jtp1u1t1yrmv" w:id="162"/>
-      <w:bookmarkEnd w:id="162"/>
-      <w:r>
-        <w:rPr>
-          <w:b w:val="1"/>
-          <w:bCs w:val="1"/>
-          <w:color w:val="000000"/>
-          <w:sz w:val="26"/>
-          <w:szCs w:val="26"/>
-          <w:rtl w:val="0"/>
-        </w:rPr>
-        <w:t xml:space="preserve">Professional Role</w:t>
-      </w:r>
-    </w:p>
-    <w:p>
-      <w:pPr>
-        <w:spacing w:after="240" w:before="240" w:lineRule="auto"/>
-        <w:rPr/>
-      </w:pPr>
-      <w:r>
-        <w:rPr>
-          <w:rtl w:val="0"/>
-        </w:rPr>
-        <w:t xml:space="preserve">Dr. Chad Patterson is a </w:t>
-      </w:r>
-      <w:r>
-        <w:rPr>
-          <w:b w:val="1"/>
-          <w:bCs w:val="1"/>
-          <w:rtl w:val="0"/>
-        </w:rPr>
-        <w:t xml:space="preserve">licensed Naturopathic Doctor</w:t>
-      </w:r>
-      <w:r>
-        <w:rPr>
-          <w:rtl w:val="0"/>
-        </w:rPr>
-        <w:t xml:space="preserve"> at Nova Clinic who provides integrative, family-centered naturopathic care, including pediatric support.</w:t>
-      </w:r>
-    </w:p>
-    <w:p>
-      <w:pPr>
-        <w:pStyle w:val="Heading3"/>
-        <w:keepNext w:val="0"/>
-        <w:keepLines w:val="0"/>
-        <w:spacing w:before="280" w:lineRule="auto"/>
-        <w:rPr>
-          <w:b w:val="1"/>
-          <w:bCs w:val="1"/>
-          <w:color w:val="000000"/>
-          <w:sz w:val="26"/>
-          <w:szCs w:val="26"/>
-        </w:rPr>
-      </w:pPr>
-      <w:bookmarkStart w:colFirst="0" w:colLast="0" w:name="_4m5d5jr7jqtr" w:id="163"/>
-      <w:bookmarkEnd w:id="163"/>
-      <w:r>
-        <w:rPr>
-          <w:b w:val="1"/>
-          <w:bCs w:val="1"/>
-          <w:color w:val="000000"/>
-          <w:sz w:val="26"/>
-          <w:szCs w:val="26"/>
-          <w:rtl w:val="0"/>
-        </w:rPr>
-        <w:t xml:space="preserve">Licensing &amp; Professional Standing</w:t>
-      </w:r>
-    </w:p>
-    <w:p>
-      <w:pPr>
-        <w:numPr>
-          <w:ilvl w:val="0"/>
-          <w:numId w:val="143"/>
-        </w:numPr>
-        <w:spacing w:after="0" w:afterAutospacing="0" w:before="240" w:lineRule="auto"/>
-        <w:ind w:left="720" w:hanging="360"/>
-      </w:pPr>
-      <w:r>
-        <w:rPr>
-          <w:rtl w:val="0"/>
-        </w:rPr>
-        <w:t xml:space="preserve">Licensed Naturopathic Doctor</w:t>
-        <w:br w:type="textWrapping"/>
-      </w:r>
-    </w:p>
-    <w:p>
-      <w:pPr>
-        <w:numPr>
-          <w:ilvl w:val="0"/>
-          <w:numId w:val="143"/>
-        </w:numPr>
-        <w:spacing w:after="0" w:afterAutospacing="0" w:before="0" w:beforeAutospacing="0" w:lineRule="auto"/>
-        <w:ind w:left="720" w:hanging="360"/>
-      </w:pPr>
-      <w:r>
-        <w:rPr>
-          <w:rtl w:val="0"/>
-        </w:rPr>
-        <w:t xml:space="preserve">Registered with the </w:t>
-      </w:r>
-      <w:r>
-        <w:rPr>
-          <w:b w:val="1"/>
-          <w:bCs w:val="1"/>
-          <w:rtl w:val="0"/>
-        </w:rPr>
-        <w:t xml:space="preserve">College of Naturopathic Doctors of Alberta</w:t>
-        <w:br w:type="textWrapping"/>
-      </w:r>
-    </w:p>
-    <w:p>
-      <w:pPr>
-        <w:numPr>
-          <w:ilvl w:val="0"/>
-          <w:numId w:val="143"/>
-        </w:numPr>
-        <w:spacing w:after="240" w:before="0" w:beforeAutospacing="0" w:lineRule="auto"/>
-        <w:ind w:left="720" w:hanging="360"/>
-      </w:pPr>
-      <w:r>
-        <w:rPr>
-          <w:rtl w:val="0"/>
-        </w:rPr>
-        <w:t xml:space="preserve">Member of the </w:t>
-      </w:r>
-      <w:r>
-        <w:rPr>
-          <w:b w:val="1"/>
-          <w:bCs w:val="1"/>
-          <w:rtl w:val="0"/>
-        </w:rPr>
-        <w:t xml:space="preserve">Canadian Association of Naturopathic Doctors</w:t>
-      </w:r>
-      <w:r>
-        <w:rPr>
-          <w:rtl w:val="0"/>
-        </w:rPr>
-      </w:r>
-    </w:p>
-    <w:p>
-      <w:pPr>
-        <w:pStyle w:val="Heading3"/>
-        <w:keepNext w:val="0"/>
-        <w:keepLines w:val="0"/>
-        <w:spacing w:before="280" w:lineRule="auto"/>
-        <w:rPr>
-          <w:b w:val="1"/>
-          <w:bCs w:val="1"/>
-          <w:color w:val="000000"/>
-          <w:sz w:val="26"/>
-          <w:szCs w:val="26"/>
-        </w:rPr>
-      </w:pPr>
-      <w:bookmarkStart w:colFirst="0" w:colLast="0" w:name="_zezn9e5ndiuf" w:id="164"/>
-      <w:bookmarkEnd w:id="164"/>
-      <w:r>
-        <w:rPr>
-          <w:b w:val="1"/>
-          <w:bCs w:val="1"/>
-          <w:color w:val="000000"/>
-          <w:sz w:val="26"/>
-          <w:szCs w:val="26"/>
-          <w:rtl w:val="0"/>
-        </w:rPr>
-        <w:t xml:space="preserve">Clinical Philosophy &amp; Approach</w:t>
-      </w:r>
-    </w:p>
-    <w:p>
-      <w:pPr>
-        <w:spacing w:after="240" w:before="240" w:lineRule="auto"/>
-        <w:rPr/>
-      </w:pPr>
-      <w:r>
-        <w:rPr>
-          <w:rtl w:val="0"/>
-        </w:rPr>
-        <w:t xml:space="preserve">Dr. Chad emphasizes </w:t>
-      </w:r>
-      <w:r>
-        <w:rPr>
-          <w:b w:val="1"/>
-          <w:bCs w:val="1"/>
-          <w:rtl w:val="0"/>
-        </w:rPr>
-        <w:t xml:space="preserve">lifestyle-based and family-oriented care</w:t>
-      </w:r>
-      <w:r>
-        <w:rPr>
-          <w:rtl w:val="0"/>
-        </w:rPr>
-        <w:t xml:space="preserve">, focusing on foundational health habits and conservative, supportive strategies. His approach prioritizes:</w:t>
-      </w:r>
-    </w:p>
-    <w:p>
-      <w:pPr>
-        <w:numPr>
-          <w:ilvl w:val="0"/>
-          <w:numId w:val="5"/>
-        </w:numPr>
-        <w:spacing w:after="0" w:afterAutospacing="0" w:before="240" w:lineRule="auto"/>
-        <w:ind w:left="720" w:hanging="360"/>
-      </w:pPr>
-      <w:r>
-        <w:rPr>
-          <w:rtl w:val="0"/>
-        </w:rPr>
-        <w:t xml:space="preserve">Education for families</w:t>
-        <w:br w:type="textWrapping"/>
-      </w:r>
-    </w:p>
-    <w:p>
-      <w:pPr>
-        <w:numPr>
-          <w:ilvl w:val="0"/>
-          <w:numId w:val="5"/>
-        </w:numPr>
-        <w:spacing w:after="0" w:afterAutospacing="0" w:before="0" w:beforeAutospacing="0" w:lineRule="auto"/>
-        <w:ind w:left="720" w:hanging="360"/>
-      </w:pPr>
-      <w:r>
-        <w:rPr>
-          <w:rtl w:val="0"/>
-        </w:rPr>
-        <w:t xml:space="preserve">Sustainable daily habits</w:t>
-        <w:br w:type="textWrapping"/>
-      </w:r>
-    </w:p>
-    <w:p>
-      <w:pPr>
-        <w:numPr>
-          <w:ilvl w:val="0"/>
-          <w:numId w:val="5"/>
-        </w:numPr>
-        <w:spacing w:after="0" w:afterAutospacing="0" w:before="0" w:beforeAutospacing="0" w:lineRule="auto"/>
-        <w:ind w:left="720" w:hanging="360"/>
-      </w:pPr>
-      <w:r>
-        <w:rPr>
-          <w:rtl w:val="0"/>
-        </w:rPr>
-        <w:t xml:space="preserve">Gentle, age-appropriate care</w:t>
-        <w:br w:type="textWrapping"/>
-      </w:r>
-    </w:p>
-    <w:p>
-      <w:pPr>
-        <w:numPr>
-          <w:ilvl w:val="0"/>
-          <w:numId w:val="5"/>
-        </w:numPr>
-        <w:spacing w:after="240" w:before="0" w:beforeAutospacing="0" w:lineRule="auto"/>
-        <w:ind w:left="720" w:hanging="360"/>
-      </w:pPr>
-      <w:r>
-        <w:rPr>
-          <w:rtl w:val="0"/>
-        </w:rPr>
-        <w:t xml:space="preserve">Whole-family health context</w:t>
-        <w:br w:type="textWrapping"/>
-      </w:r>
-    </w:p>
-    <w:p>
-      <w:pPr>
-        <w:pStyle w:val="Heading3"/>
-        <w:keepNext w:val="0"/>
-        <w:keepLines w:val="0"/>
-        <w:spacing w:before="280" w:lineRule="auto"/>
-        <w:rPr>
-          <w:b w:val="1"/>
-          <w:bCs w:val="1"/>
-          <w:color w:val="000000"/>
-          <w:sz w:val="26"/>
-          <w:szCs w:val="26"/>
-        </w:rPr>
-      </w:pPr>
-      <w:bookmarkStart w:colFirst="0" w:colLast="0" w:name="_2iib2qosy6lv" w:id="165"/>
-      <w:bookmarkEnd w:id="165"/>
-      <w:r>
-        <w:rPr>
-          <w:b w:val="1"/>
-          <w:bCs w:val="1"/>
-          <w:color w:val="000000"/>
-          <w:sz w:val="26"/>
-          <w:szCs w:val="26"/>
-          <w:rtl w:val="0"/>
-        </w:rPr>
-        <w:t xml:space="preserve">Scope of Practice &amp; Areas of Focus </w:t>
-      </w:r>
-    </w:p>
-    <w:p>
-      <w:pPr>
-        <w:pStyle w:val="Heading3"/>
-        <w:keepNext w:val="0"/>
-        <w:keepLines w:val="0"/>
-        <w:spacing w:before="280" w:lineRule="auto"/>
-        <w:rPr>
-          <w:b w:val="1"/>
-          <w:bCs w:val="1"/>
-          <w:color w:val="000000"/>
-          <w:sz w:val="26"/>
-          <w:szCs w:val="26"/>
-        </w:rPr>
-      </w:pPr>
-      <w:bookmarkStart w:colFirst="0" w:colLast="0" w:name="_ltgas4kre137" w:id="166"/>
-      <w:bookmarkEnd w:id="166"/>
-      <w:r>
-        <w:rPr>
-          <w:b w:val="1"/>
-          <w:bCs w:val="1"/>
-          <w:color w:val="000000"/>
-          <w:sz w:val="26"/>
-          <w:szCs w:val="26"/>
-          <w:rtl w:val="0"/>
-        </w:rPr>
-        <w:t xml:space="preserve">(Non-diagnostic)</w:t>
-      </w:r>
-    </w:p>
-    <w:p>
-      <w:pPr>
-        <w:spacing w:after="240" w:before="240" w:lineRule="auto"/>
-        <w:rPr/>
-      </w:pPr>
-      <w:r>
-        <w:rPr>
-          <w:rtl w:val="0"/>
-        </w:rPr>
-        <w:t xml:space="preserve">Dr. Chad commonly supports:</w:t>
-      </w:r>
-    </w:p>
-    <w:p>
-      <w:pPr>
-        <w:numPr>
-          <w:ilvl w:val="0"/>
-          <w:numId w:val="181"/>
-        </w:numPr>
-        <w:spacing w:after="0" w:afterAutospacing="0" w:before="240" w:lineRule="auto"/>
-        <w:ind w:left="720" w:hanging="360"/>
-      </w:pPr>
-      <w:r>
-        <w:rPr>
-          <w:rtl w:val="0"/>
-        </w:rPr>
-        <w:t xml:space="preserve">Pediatric and adolescent care</w:t>
-        <w:br w:type="textWrapping"/>
-      </w:r>
-    </w:p>
-    <w:p>
-      <w:pPr>
-        <w:numPr>
-          <w:ilvl w:val="0"/>
-          <w:numId w:val="181"/>
-        </w:numPr>
-        <w:spacing w:after="0" w:afterAutospacing="0" w:before="0" w:beforeAutospacing="0" w:lineRule="auto"/>
-        <w:ind w:left="720" w:hanging="360"/>
-      </w:pPr>
-      <w:r>
-        <w:rPr>
-          <w:rtl w:val="0"/>
-        </w:rPr>
-        <w:t xml:space="preserve">Family health</w:t>
-        <w:br w:type="textWrapping"/>
-      </w:r>
-    </w:p>
-    <w:p>
-      <w:pPr>
-        <w:numPr>
-          <w:ilvl w:val="0"/>
-          <w:numId w:val="181"/>
-        </w:numPr>
-        <w:spacing w:after="0" w:afterAutospacing="0" w:before="0" w:beforeAutospacing="0" w:lineRule="auto"/>
-        <w:ind w:left="720" w:hanging="360"/>
-      </w:pPr>
-      <w:r>
-        <w:rPr>
-          <w:rtl w:val="0"/>
-        </w:rPr>
-        <w:t xml:space="preserve">Digestive concerns</w:t>
-        <w:br w:type="textWrapping"/>
-      </w:r>
-    </w:p>
-    <w:p>
-      <w:pPr>
-        <w:numPr>
-          <w:ilvl w:val="0"/>
-          <w:numId w:val="181"/>
-        </w:numPr>
-        <w:spacing w:after="0" w:afterAutospacing="0" w:before="0" w:beforeAutospacing="0" w:lineRule="auto"/>
-        <w:ind w:left="720" w:hanging="360"/>
-      </w:pPr>
-      <w:r>
-        <w:rPr>
-          <w:rtl w:val="0"/>
-        </w:rPr>
-        <w:t xml:space="preserve">Immune system support</w:t>
-        <w:br w:type="textWrapping"/>
-      </w:r>
-    </w:p>
-    <w:p>
-      <w:pPr>
-        <w:numPr>
-          <w:ilvl w:val="0"/>
-          <w:numId w:val="181"/>
-        </w:numPr>
-        <w:spacing w:after="0" w:afterAutospacing="0" w:before="0" w:beforeAutospacing="0" w:lineRule="auto"/>
-        <w:ind w:left="720" w:hanging="360"/>
-      </w:pPr>
-      <w:r>
-        <w:rPr>
-          <w:rtl w:val="0"/>
-        </w:rPr>
-        <w:t xml:space="preserve">Allergies and asthma support</w:t>
-        <w:br w:type="textWrapping"/>
-      </w:r>
-    </w:p>
-    <w:p>
-      <w:pPr>
-        <w:numPr>
-          <w:ilvl w:val="0"/>
-          <w:numId w:val="181"/>
-        </w:numPr>
-        <w:spacing w:after="240" w:before="0" w:beforeAutospacing="0" w:lineRule="auto"/>
-        <w:ind w:left="720" w:hanging="360"/>
-      </w:pPr>
-      <w:r>
-        <w:rPr>
-          <w:rtl w:val="0"/>
-        </w:rPr>
-        <w:t xml:space="preserve">Lifestyle and habit-based health strategies</w:t>
-        <w:br w:type="textWrapping"/>
-      </w:r>
-    </w:p>
-    <w:p>
-      <w:pPr>
-        <w:pStyle w:val="Heading3"/>
-        <w:keepNext w:val="0"/>
-        <w:keepLines w:val="0"/>
-        <w:spacing w:before="280" w:lineRule="auto"/>
-        <w:rPr>
-          <w:b w:val="1"/>
-          <w:bCs w:val="1"/>
-          <w:color w:val="000000"/>
-          <w:sz w:val="26"/>
-          <w:szCs w:val="26"/>
-        </w:rPr>
-      </w:pPr>
-      <w:bookmarkStart w:colFirst="0" w:colLast="0" w:name="_le39pm7051fv" w:id="167"/>
-      <w:bookmarkEnd w:id="167"/>
-      <w:r>
-        <w:rPr>
-          <w:b w:val="1"/>
-          <w:bCs w:val="1"/>
-          <w:color w:val="000000"/>
-          <w:sz w:val="26"/>
-          <w:szCs w:val="26"/>
-          <w:rtl w:val="0"/>
-        </w:rPr>
-        <w:t xml:space="preserve">Modalities Commonly Used</w:t>
-      </w:r>
-    </w:p>
-    <w:p>
-      <w:pPr>
-        <w:numPr>
-          <w:ilvl w:val="0"/>
-          <w:numId w:val="35"/>
-        </w:numPr>
-        <w:spacing w:after="0" w:afterAutospacing="0" w:before="240" w:lineRule="auto"/>
-        <w:ind w:left="720" w:hanging="360"/>
-      </w:pPr>
-      <w:r>
-        <w:rPr>
-          <w:rtl w:val="0"/>
-        </w:rPr>
-        <w:t xml:space="preserve">Lifestyle counseling</w:t>
-        <w:br w:type="textWrapping"/>
-      </w:r>
-    </w:p>
-    <w:p>
-      <w:pPr>
-        <w:numPr>
-          <w:ilvl w:val="0"/>
-          <w:numId w:val="35"/>
-        </w:numPr>
-        <w:spacing w:after="0" w:afterAutospacing="0" w:before="0" w:beforeAutospacing="0" w:lineRule="auto"/>
-        <w:ind w:left="720" w:hanging="360"/>
-      </w:pPr>
-      <w:r>
-        <w:rPr>
-          <w:rtl w:val="0"/>
-        </w:rPr>
-        <w:t xml:space="preserve">Nutrition guidance</w:t>
-        <w:br w:type="textWrapping"/>
-      </w:r>
-    </w:p>
-    <w:p>
-      <w:pPr>
-        <w:numPr>
-          <w:ilvl w:val="0"/>
-          <w:numId w:val="35"/>
-        </w:numPr>
-        <w:spacing w:after="0" w:afterAutospacing="0" w:before="0" w:beforeAutospacing="0" w:lineRule="auto"/>
-        <w:ind w:left="720" w:hanging="360"/>
-      </w:pPr>
-      <w:r>
-        <w:rPr>
-          <w:rtl w:val="0"/>
-        </w:rPr>
-        <w:t xml:space="preserve">Education-focused care plans</w:t>
-        <w:br w:type="textWrapping"/>
-      </w:r>
-    </w:p>
-    <w:p>
-      <w:pPr>
-        <w:numPr>
-          <w:ilvl w:val="0"/>
-          <w:numId w:val="35"/>
-        </w:numPr>
-        <w:spacing w:after="240" w:before="0" w:beforeAutospacing="0" w:lineRule="auto"/>
-        <w:ind w:left="720" w:hanging="360"/>
-      </w:pPr>
-      <w:r>
-        <w:rPr>
-          <w:rtl w:val="0"/>
-        </w:rPr>
-        <w:t xml:space="preserve">Conservative naturopathic approaches</w:t>
-        <w:br w:type="textWrapping"/>
-      </w:r>
-    </w:p>
-    <w:p>
-      <w:pPr>
-        <w:pStyle w:val="Heading3"/>
-        <w:keepNext w:val="0"/>
-        <w:keepLines w:val="0"/>
-        <w:spacing w:before="280" w:lineRule="auto"/>
-        <w:rPr>
-          <w:b w:val="1"/>
-          <w:bCs w:val="1"/>
-          <w:color w:val="000000"/>
-          <w:sz w:val="26"/>
-          <w:szCs w:val="26"/>
-        </w:rPr>
-      </w:pPr>
-      <w:bookmarkStart w:colFirst="0" w:colLast="0" w:name="_bl01voq65301" w:id="168"/>
-      <w:bookmarkEnd w:id="168"/>
-      <w:r>
-        <w:rPr>
-          <w:b w:val="1"/>
-          <w:bCs w:val="1"/>
-          <w:color w:val="000000"/>
-          <w:sz w:val="26"/>
-          <w:szCs w:val="26"/>
-          <w:rtl w:val="0"/>
-        </w:rPr>
-        <w:t xml:space="preserve">Typical Patient Fit (Assistant Intelligence)</w:t>
-      </w:r>
-    </w:p>
-    <w:p>
-      <w:pPr>
-        <w:spacing w:after="240" w:before="240" w:lineRule="auto"/>
-        <w:rPr/>
-      </w:pPr>
-      <w:r>
-        <w:rPr>
-          <w:rtl w:val="0"/>
-        </w:rPr>
-        <w:t xml:space="preserve">Patients who often book with Dr. Chad include:</w:t>
-      </w:r>
-    </w:p>
-    <w:p>
-      <w:pPr>
-        <w:numPr>
-          <w:ilvl w:val="0"/>
-          <w:numId w:val="156"/>
-        </w:numPr>
-        <w:spacing w:after="0" w:afterAutospacing="0" w:before="240" w:lineRule="auto"/>
-        <w:ind w:left="720" w:hanging="360"/>
-      </w:pPr>
-      <w:r>
-        <w:rPr>
-          <w:rtl w:val="0"/>
-        </w:rPr>
-        <w:t xml:space="preserve">Parents seeking care for children</w:t>
-        <w:br w:type="textWrapping"/>
-      </w:r>
-    </w:p>
-    <w:p>
-      <w:pPr>
-        <w:numPr>
-          <w:ilvl w:val="0"/>
-          <w:numId w:val="156"/>
-        </w:numPr>
-        <w:spacing w:after="0" w:afterAutospacing="0" w:before="0" w:beforeAutospacing="0" w:lineRule="auto"/>
-        <w:ind w:left="720" w:hanging="360"/>
-      </w:pPr>
-      <w:r>
-        <w:rPr>
-          <w:rtl w:val="0"/>
-        </w:rPr>
-        <w:t xml:space="preserve">Families wanting integrative support</w:t>
-        <w:br w:type="textWrapping"/>
-      </w:r>
-    </w:p>
-    <w:p>
-      <w:pPr>
-        <w:numPr>
-          <w:ilvl w:val="0"/>
-          <w:numId w:val="156"/>
-        </w:numPr>
-        <w:spacing w:after="0" w:afterAutospacing="0" w:before="0" w:beforeAutospacing="0" w:lineRule="auto"/>
-        <w:ind w:left="720" w:hanging="360"/>
-      </w:pPr>
-      <w:r>
-        <w:rPr>
-          <w:rtl w:val="0"/>
-        </w:rPr>
-        <w:t xml:space="preserve">Patients preferring lifestyle-first approaches</w:t>
-        <w:br w:type="textWrapping"/>
-      </w:r>
-    </w:p>
-    <w:p>
-      <w:pPr>
-        <w:numPr>
-          <w:ilvl w:val="0"/>
-          <w:numId w:val="156"/>
-        </w:numPr>
-        <w:spacing w:after="240" w:before="0" w:beforeAutospacing="0" w:lineRule="auto"/>
-        <w:ind w:left="720" w:hanging="360"/>
-      </w:pPr>
-      <w:r>
-        <w:rPr>
-          <w:rtl w:val="0"/>
-        </w:rPr>
-        <w:t xml:space="preserve">Individuals seeking conservative, educational care</w:t>
-        <w:br w:type="textWrapping"/>
-      </w:r>
-    </w:p>
-    <w:p>
-      <w:pPr>
-        <w:pStyle w:val="Heading3"/>
-        <w:keepNext w:val="0"/>
-        <w:keepLines w:val="0"/>
-        <w:spacing w:before="280" w:lineRule="auto"/>
-        <w:rPr>
-          <w:b w:val="1"/>
-          <w:bCs w:val="1"/>
-          <w:color w:val="000000"/>
-          <w:sz w:val="26"/>
-          <w:szCs w:val="26"/>
-        </w:rPr>
-      </w:pPr>
-      <w:bookmarkStart w:colFirst="0" w:colLast="0" w:name="_uigat8c9ov03" w:id="169"/>
-      <w:bookmarkEnd w:id="169"/>
-      <w:r>
-        <w:rPr>
-          <w:b w:val="1"/>
-          <w:bCs w:val="1"/>
-          <w:color w:val="000000"/>
-          <w:sz w:val="26"/>
-          <w:szCs w:val="26"/>
-          <w:rtl w:val="0"/>
-        </w:rPr>
-        <w:t xml:space="preserve">Appointment Types Offered</w:t>
-      </w:r>
-    </w:p>
-    <w:p>
-      <w:pPr>
-        <w:numPr>
-          <w:ilvl w:val="0"/>
-          <w:numId w:val="103"/>
-        </w:numPr>
-        <w:spacing w:after="0" w:afterAutospacing="0" w:before="240" w:lineRule="auto"/>
-        <w:ind w:left="720" w:hanging="360"/>
-      </w:pPr>
-      <w:r>
-        <w:rPr>
-          <w:rtl w:val="0"/>
-        </w:rPr>
-        <w:t xml:space="preserve">Pediatric Naturopathic Consultations</w:t>
-        <w:br w:type="textWrapping"/>
-      </w:r>
-    </w:p>
-    <w:p>
-      <w:pPr>
-        <w:numPr>
-          <w:ilvl w:val="0"/>
-          <w:numId w:val="103"/>
-        </w:numPr>
-        <w:spacing w:after="0" w:afterAutospacing="0" w:before="0" w:beforeAutospacing="0" w:lineRule="auto"/>
-        <w:ind w:left="720" w:hanging="360"/>
-      </w:pPr>
-      <w:r>
-        <w:rPr>
-          <w:rtl w:val="0"/>
-        </w:rPr>
-        <w:t xml:space="preserve">Initial Naturopathic Consultations</w:t>
-        <w:br w:type="textWrapping"/>
-      </w:r>
-    </w:p>
-    <w:p>
-      <w:pPr>
-        <w:numPr>
-          <w:ilvl w:val="0"/>
-          <w:numId w:val="103"/>
-        </w:numPr>
-        <w:spacing w:after="240" w:before="0" w:beforeAutospacing="0" w:lineRule="auto"/>
-        <w:ind w:left="720" w:hanging="360"/>
-      </w:pPr>
-      <w:r>
-        <w:rPr>
-          <w:rtl w:val="0"/>
-        </w:rPr>
-        <w:t xml:space="preserve">Follow-Up Naturopathic Appointments</w:t>
-        <w:br w:type="textWrapping"/>
-      </w:r>
-    </w:p>
-    <w:p>
-      <w:pPr>
-        <w:pStyle w:val="Heading3"/>
-        <w:keepNext w:val="0"/>
-        <w:keepLines w:val="0"/>
-        <w:spacing w:before="280" w:lineRule="auto"/>
-        <w:rPr>
-          <w:b w:val="1"/>
-          <w:bCs w:val="1"/>
-          <w:color w:val="000000"/>
-          <w:sz w:val="26"/>
-          <w:szCs w:val="26"/>
-        </w:rPr>
-      </w:pPr>
-      <w:bookmarkStart w:colFirst="0" w:colLast="0" w:name="_ctpepaqu304f" w:id="170"/>
-      <w:bookmarkEnd w:id="170"/>
-      <w:r>
-        <w:rPr>
-          <w:b w:val="1"/>
-          <w:bCs w:val="1"/>
-          <w:color w:val="000000"/>
-          <w:sz w:val="26"/>
-          <w:szCs w:val="26"/>
-          <w:rtl w:val="0"/>
-        </w:rPr>
-        <w:t xml:space="preserve">Booking Guidance (AI Use)</w:t>
-      </w:r>
-    </w:p>
-    <w:p>
-      <w:pPr>
-        <w:numPr>
-          <w:ilvl w:val="0"/>
-          <w:numId w:val="81"/>
-        </w:numPr>
-        <w:spacing w:after="0" w:afterAutospacing="0" w:before="240" w:lineRule="auto"/>
-        <w:ind w:left="720" w:hanging="360"/>
-      </w:pPr>
-      <w:r>
-        <w:rPr>
-          <w:rFonts w:ascii="Arial Unicode MS" w:cs="Arial Unicode MS" w:eastAsia="Arial Unicode MS" w:hAnsi="Arial Unicode MS"/>
-          <w:rtl w:val="0"/>
-        </w:rPr>
-        <w:t xml:space="preserve">Pediatric patients → </w:t>
-      </w:r>
-      <w:r>
-        <w:rPr>
-          <w:b w:val="1"/>
-          <w:bCs w:val="1"/>
-          <w:rtl w:val="0"/>
-        </w:rPr>
-        <w:t xml:space="preserve">Pediatric Naturopathic Consult</w:t>
-        <w:br w:type="textWrapping"/>
-      </w:r>
-    </w:p>
-    <w:p>
-      <w:pPr>
-        <w:numPr>
-          <w:ilvl w:val="0"/>
-          <w:numId w:val="81"/>
-        </w:numPr>
-        <w:spacing w:after="0" w:afterAutospacing="0" w:before="0" w:beforeAutospacing="0" w:lineRule="auto"/>
-        <w:ind w:left="720" w:hanging="360"/>
-      </w:pPr>
-      <w:r>
-        <w:rPr>
-          <w:rtl w:val="0"/>
-        </w:rPr>
-        <w:t xml:space="preserve">Parents/guardians must attend appointments</w:t>
-        <w:br w:type="textWrapping"/>
-      </w:r>
-    </w:p>
-    <w:p>
-      <w:pPr>
-        <w:numPr>
-          <w:ilvl w:val="0"/>
-          <w:numId w:val="81"/>
-        </w:numPr>
-        <w:spacing w:after="240" w:before="0" w:beforeAutospacing="0" w:lineRule="auto"/>
-        <w:ind w:left="720" w:hanging="360"/>
-      </w:pPr>
-      <w:r>
-        <w:rPr>
-          <w:rFonts w:ascii="Arial Unicode MS" w:cs="Arial Unicode MS" w:eastAsia="Arial Unicode MS" w:hAnsi="Arial Unicode MS"/>
-          <w:rtl w:val="0"/>
-        </w:rPr>
-        <w:t xml:space="preserve">If unsure → contact clinic for guidance</w:t>
-        <w:br w:type="textWrapping"/>
-      </w:r>
-    </w:p>
-    <w:p>
-      <w:pPr>
-        <w:spacing w:after="240" w:before="240" w:lineRule="auto"/>
-        <w:rPr/>
-      </w:pPr>
-      <w:r>
-        <w:rPr>
-          <w:rtl w:val="0"/>
-        </w:rPr>
-      </w:r>
-    </w:p>
-    <w:p>
-      <w:pPr>
-        <w:spacing w:after="240" w:before="240" w:lineRule="auto"/>
-        <w:rPr/>
-      </w:pPr>
-      <w:r>
-        <w:rPr>
-          <w:rtl w:val="0"/>
-        </w:rPr>
-      </w:r>
-    </w:p>
-    <w:p>
-      <w:pPr>
-        <w:spacing w:after="240" w:before="240" w:lineRule="auto"/>
-        <w:rPr/>
-      </w:pPr>
-      <w:r>
-        <w:rPr>
-          <w:rtl w:val="0"/>
-        </w:rPr>
-      </w:r>
-    </w:p>
-    <w:p>
-      <w:pPr>
-        <w:pStyle w:val="Heading2"/>
-        <w:keepNext w:val="0"/>
-        <w:keepLines w:val="0"/>
-        <w:spacing w:after="80" w:lineRule="auto"/>
-        <w:rPr>
-          <w:b w:val="1"/>
-          <w:bCs w:val="1"/>
-          <w:sz w:val="34"/>
-          <w:szCs w:val="34"/>
-        </w:rPr>
-      </w:pPr>
-      <w:bookmarkStart w:colFirst="0" w:colLast="0" w:name="_h41gtkp4e86p" w:id="171"/>
-      <w:bookmarkEnd w:id="171"/>
-      <w:r>
-        <w:rPr>
-          <w:b w:val="1"/>
-          <w:bCs w:val="1"/>
-          <w:sz w:val="34"/>
-          <w:szCs w:val="34"/>
-          <w:rtl w:val="0"/>
-        </w:rPr>
-        <w:t xml:space="preserve">4. PRACTITIONER: Dr. Alexa Torontow, ND</w:t>
+        <w:t>3. PRACTITIONER: Dr. Alexa Torontow, ND</w:t>
       </w:r>
     </w:p>
     <w:p>
@@ -17951,7 +17075,7 @@
           <w:szCs w:val="34"/>
           <w:rtl w:val="0"/>
         </w:rPr>
-        <w:t xml:space="preserve">5. PRACTITIONER: Lorena Bulcao, Dr. Ac, TCMD, RMT</w:t>
+        <w:t>4. PRACTITIONER: Lorena Bulcao, Dr. Ac, TCMD, RMT</w:t>
       </w:r>
     </w:p>
     <w:p>
@@ -18618,6 +17742,1046 @@
         <w:rPr>
           <w:rtl w:val="0"/>
         </w:rPr>
+      </w:r>
+    </w:p>
+    <w:p>
+      <w:pPr>
+        <w:pStyle w:val="Normal"/>
+      </w:pPr>
+      <w:r>
+        <w:t xml:space="preserve">Combined session → Combined Massage + Acupuncture</w:t>
+      </w:r>
+    </w:p>
+    <w:p>
+      <w:pPr>
+        <w:pStyle w:val="Normal"/>
+      </w:pPr>
+      <w:r>
+        <w:t xml:space="preserve">Massage patients → Massage Therapy appointment</w:t>
+      </w:r>
+    </w:p>
+    <w:p>
+      <w:pPr>
+        <w:pStyle w:val="Normal"/>
+      </w:pPr>
+      <w:r>
+        <w:t xml:space="preserve">Acupuncture patients → Acupuncture appointment</w:t>
+      </w:r>
+    </w:p>
+    <w:p>
+      <w:pPr>
+        <w:pStyle w:val="Heading 3"/>
+      </w:pPr>
+      <w:r>
+        <w:t xml:space="preserve">Booking Guidance (AI Use)</w:t>
+      </w:r>
+    </w:p>
+    <w:p>
+      <w:pPr>
+        <w:pStyle w:val="Normal"/>
+      </w:pPr>
+      <w:r>
+        <w:t xml:space="preserve">Combined Massage + Acupuncture sessions</w:t>
+      </w:r>
+    </w:p>
+    <w:p>
+      <w:pPr>
+        <w:pStyle w:val="Normal"/>
+      </w:pPr>
+      <w:r>
+        <w:t xml:space="preserve">Massage Therapy sessions (30, 60, 90 minutes)</w:t>
+      </w:r>
+    </w:p>
+    <w:p>
+      <w:pPr>
+        <w:pStyle w:val="Normal"/>
+      </w:pPr>
+      <w:r>
+        <w:t xml:space="preserve">Cupping sessions</w:t>
+      </w:r>
+    </w:p>
+    <w:p>
+      <w:pPr>
+        <w:pStyle w:val="Normal"/>
+      </w:pPr>
+      <w:r>
+        <w:t xml:space="preserve">Acupuncture sessions (initial &amp; follow-up)</w:t>
+      </w:r>
+    </w:p>
+    <w:p>
+      <w:pPr>
+        <w:pStyle w:val="Heading 3"/>
+      </w:pPr>
+      <w:r>
+        <w:t xml:space="preserve">Appointment Types Offered</w:t>
+      </w:r>
+    </w:p>
+    <w:p>
+      <w:pPr>
+        <w:pStyle w:val="Normal"/>
+      </w:pPr>
+      <w:r>
+        <w:t xml:space="preserve">Those wanting a compassionate, whole-body approach</w:t>
+      </w:r>
+    </w:p>
+    <w:p>
+      <w:pPr>
+        <w:pStyle w:val="Normal"/>
+      </w:pPr>
+      <w:r>
+        <w:t xml:space="preserve">People seeking nervous system regulation and stress relief</w:t>
+      </w:r>
+    </w:p>
+    <w:p>
+      <w:pPr>
+        <w:pStyle w:val="Normal"/>
+      </w:pPr>
+      <w:r>
+        <w:t xml:space="preserve">Patients recovering from surgery or injury</w:t>
+      </w:r>
+    </w:p>
+    <w:p>
+      <w:pPr>
+        <w:pStyle w:val="Normal"/>
+      </w:pPr>
+      <w:r>
+        <w:t xml:space="preserve">Individuals dealing with chronic pain or tension</w:t>
+      </w:r>
+    </w:p>
+    <w:p>
+      <w:pPr>
+        <w:pStyle w:val="Normal"/>
+      </w:pPr>
+      <w:r>
+        <w:t xml:space="preserve">Patients who may prefer Emily include:</w:t>
+      </w:r>
+    </w:p>
+    <w:p>
+      <w:pPr>
+        <w:pStyle w:val="Heading 3"/>
+      </w:pPr>
+      <w:r>
+        <w:t xml:space="preserve">Typical Patient Fit (Assistant Intelligence)</w:t>
+      </w:r>
+    </w:p>
+    <w:p>
+      <w:pPr>
+        <w:pStyle w:val="Normal"/>
+      </w:pPr>
+      <w:r>
+        <w:t xml:space="preserve">Herbal medicine</w:t>
+      </w:r>
+    </w:p>
+    <w:p>
+      <w:pPr>
+        <w:pStyle w:val="Normal"/>
+      </w:pPr>
+      <w:r>
+        <w:t xml:space="preserve">Traditional Chinese Medicine techniques</w:t>
+      </w:r>
+    </w:p>
+    <w:p>
+      <w:pPr>
+        <w:pStyle w:val="Normal"/>
+      </w:pPr>
+      <w:r>
+        <w:t xml:space="preserve">IASTM (Instrument-Assisted Soft Tissue Mobilization)</w:t>
+      </w:r>
+    </w:p>
+    <w:p>
+      <w:pPr>
+        <w:pStyle w:val="Normal"/>
+      </w:pPr>
+      <w:r>
+        <w:t xml:space="preserve">Cupping therapy</w:t>
+      </w:r>
+    </w:p>
+    <w:p>
+      <w:pPr>
+        <w:pStyle w:val="Normal"/>
+      </w:pPr>
+      <w:r>
+        <w:t xml:space="preserve">Acupuncture</w:t>
+      </w:r>
+    </w:p>
+    <w:p>
+      <w:pPr>
+        <w:pStyle w:val="Normal"/>
+      </w:pPr>
+      <w:r>
+        <w:t xml:space="preserve">Therapeutic massage</w:t>
+      </w:r>
+    </w:p>
+    <w:p>
+      <w:pPr>
+        <w:pStyle w:val="Heading 3"/>
+      </w:pPr>
+      <w:r>
+        <w:t xml:space="preserve">Modalities Commonly Used</w:t>
+      </w:r>
+    </w:p>
+    <w:p>
+      <w:pPr>
+        <w:pStyle w:val="Normal"/>
+      </w:pPr>
+      <w:r>
+        <w:t xml:space="preserve">Pre/post-surgical rehabilitation and scar tissue care</w:t>
+      </w:r>
+    </w:p>
+    <w:p>
+      <w:pPr>
+        <w:pStyle w:val="Normal"/>
+      </w:pPr>
+      <w:r>
+        <w:t xml:space="preserve">Postural and alignment-focused care</w:t>
+      </w:r>
+    </w:p>
+    <w:p>
+      <w:pPr>
+        <w:pStyle w:val="Normal"/>
+      </w:pPr>
+      <w:r>
+        <w:t xml:space="preserve">Mobility restoration and gentle movement support</w:t>
+      </w:r>
+    </w:p>
+    <w:p>
+      <w:pPr>
+        <w:pStyle w:val="Normal"/>
+      </w:pPr>
+      <w:r>
+        <w:t xml:space="preserve">Nervous system regulation and stress-related pain</w:t>
+      </w:r>
+    </w:p>
+    <w:p>
+      <w:pPr>
+        <w:pStyle w:val="Normal"/>
+      </w:pPr>
+      <w:r>
+        <w:t xml:space="preserve">Chronic illness and systemic conditions</w:t>
+      </w:r>
+    </w:p>
+    <w:p>
+      <w:pPr>
+        <w:pStyle w:val="Normal"/>
+      </w:pPr>
+      <w:r>
+        <w:t xml:space="preserve">Chronic pain and tension management</w:t>
+      </w:r>
+    </w:p>
+    <w:p>
+      <w:pPr>
+        <w:pStyle w:val="Normal"/>
+      </w:pPr>
+      <w:r>
+        <w:t xml:space="preserve">Emily commonly supports:</w:t>
+      </w:r>
+    </w:p>
+    <w:p>
+      <w:pPr>
+        <w:pStyle w:val="Heading 3"/>
+      </w:pPr>
+      <w:r>
+        <w:t xml:space="preserve">(Non-diagnostic)</w:t>
+      </w:r>
+    </w:p>
+    <w:p>
+      <w:pPr>
+        <w:pStyle w:val="Heading 3"/>
+      </w:pPr>
+      <w:r>
+        <w:t xml:space="preserve">Scope of Practice &amp; Areas of Focus</w:t>
+      </w:r>
+    </w:p>
+    <w:p>
+      <w:pPr>
+        <w:pStyle w:val="Normal"/>
+      </w:pPr>
+      <w:r>
+        <w:t xml:space="preserve">Emily employs a compassionate, whole-body approach to supporting chronic pain, chronic illness, and long-term wellbeing. Her methods integrate therapeutic massage, acupuncture, cupping, and gentle manual techniques designed to calm the nervous system and support natural healing.</w:t>
+      </w:r>
+    </w:p>
+    <w:p>
+      <w:pPr>
+        <w:pStyle w:val="Heading 3"/>
+      </w:pPr>
+      <w:r>
+        <w:t xml:space="preserve">Clinical Philosophy &amp; Approach</w:t>
+      </w:r>
+    </w:p>
+    <w:p>
+      <w:pPr>
+        <w:pStyle w:val="Normal"/>
+      </w:pPr>
+      <w:r>
+        <w:t xml:space="preserve">More than eight years of clinical experience</w:t>
+      </w:r>
+    </w:p>
+    <w:p>
+      <w:pPr>
+        <w:pStyle w:val="Normal"/>
+      </w:pPr>
+      <w:r>
+        <w:t xml:space="preserve">Trained in herbal medicine and cupping therapy</w:t>
+      </w:r>
+    </w:p>
+    <w:p>
+      <w:pPr>
+        <w:pStyle w:val="Normal"/>
+      </w:pPr>
+      <w:r>
+        <w:t xml:space="preserve">Certified in IASTM (Instrument-Assisted Soft Tissue Mobilization)</w:t>
+      </w:r>
+    </w:p>
+    <w:p>
+      <w:pPr>
+        <w:pStyle w:val="Normal"/>
+      </w:pPr>
+      <w:r>
+        <w:t xml:space="preserve">Registered Massage Therapist (RMT)</w:t>
+      </w:r>
+    </w:p>
+    <w:p>
+      <w:pPr>
+        <w:pStyle w:val="Normal"/>
+      </w:pPr>
+      <w:r>
+        <w:t xml:space="preserve">Traditional Chinese Medicine Doctor (TCMD)</w:t>
+      </w:r>
+    </w:p>
+    <w:p>
+      <w:pPr>
+        <w:pStyle w:val="Normal"/>
+      </w:pPr>
+      <w:r>
+        <w:t xml:space="preserve">Doctor of Acupuncture (Dr. Acu)</w:t>
+      </w:r>
+    </w:p>
+    <w:p>
+      <w:pPr>
+        <w:pStyle w:val="Heading 3"/>
+      </w:pPr>
+      <w:r>
+        <w:t xml:space="preserve">Credentials &amp; Training</w:t>
+      </w:r>
+    </w:p>
+    <w:p>
+      <w:pPr>
+        <w:pStyle w:val="Heading2"/>
+      </w:pPr>
+      <w:r>
+        <w:t xml:space="preserve">5. PRACTITIONER: Dr. Madison Thorne, ND</w:t>
+      </w:r>
+    </w:p>
+    <w:p>
+      <w:pPr>
+        <w:pStyle w:val="Heading3"/>
+      </w:pPr>
+      <w:r>
+        <w:t xml:space="preserve">Professional Role</w:t>
+      </w:r>
+    </w:p>
+    <w:p>
+      <w:pPr>
+        <w:pStyle w:val="Normal"/>
+      </w:pPr>
+      <w:r>
+        <w:t xml:space="preserve">Dr. Madison Thorne is a licensed Naturopathic Doctor at Nova Naturopathic Integrative Clinic. She maintains a full-time practice in general naturopathic medicine with a clinical focus on women's hormonal health.</w:t>
+      </w:r>
+    </w:p>
+    <w:p>
+      <w:pPr>
+        <w:pStyle w:val="Heading3"/>
+      </w:pPr>
+      <w:r>
+        <w:t xml:space="preserve">Licensing &amp; Professional Standing</w:t>
+      </w:r>
+    </w:p>
+    <w:p>
+      <w:pPr>
+        <w:pStyle w:val="Normal"/>
+      </w:pPr>
+      <w:r>
+        <w:t xml:space="preserve">Licensed Naturopathic Doctor</w:t>
+      </w:r>
+    </w:p>
+    <w:p>
+      <w:pPr>
+        <w:pStyle w:val="Normal"/>
+      </w:pPr>
+      <w:r>
+        <w:t xml:space="preserve">Registered with the College of Naturopathic Doctors of Alberta</w:t>
+      </w:r>
+    </w:p>
+    <w:p>
+      <w:pPr>
+        <w:pStyle w:val="Normal"/>
+      </w:pPr>
+      <w:r>
+        <w:t xml:space="preserve">Member of the Canadian Association of Naturopathic Doctors</w:t>
+      </w:r>
+    </w:p>
+    <w:p>
+      <w:pPr>
+        <w:pStyle w:val="Normal"/>
+      </w:pPr>
+      <w:r>
+        <w:t xml:space="preserve">Member of the Alberta Association of Naturopathic Doctors</w:t>
+      </w:r>
+    </w:p>
+    <w:p>
+      <w:pPr>
+        <w:pStyle w:val="Normal"/>
+      </w:pPr>
+      <w:r>
+        <w:t xml:space="preserve">Member of the Oncology Association of Naturopathic Doctors</w:t>
+      </w:r>
+    </w:p>
+    <w:p>
+      <w:pPr>
+        <w:pStyle w:val="Heading3"/>
+      </w:pPr>
+      <w:r>
+        <w:t xml:space="preserve">Education &amp; Training</w:t>
+      </w:r>
+    </w:p>
+    <w:p>
+      <w:pPr>
+        <w:pStyle w:val="Normal"/>
+      </w:pPr>
+      <w:r>
+        <w:t xml:space="preserve">Naturopathic Medical Degree from the Canadian College of Naturopathic Medicine</w:t>
+      </w:r>
+    </w:p>
+    <w:p>
+      <w:pPr>
+        <w:pStyle w:val="Normal"/>
+      </w:pPr>
+      <w:r>
+        <w:t xml:space="preserve">Degree in Kinesiology</w:t>
+      </w:r>
+    </w:p>
+    <w:p>
+      <w:pPr>
+        <w:pStyle w:val="Normal"/>
+      </w:pPr>
+      <w:r>
+        <w:t xml:space="preserve">Previously worked as a personal trainer before pursuing naturopathic medicine</w:t>
+      </w:r>
+    </w:p>
+    <w:p>
+      <w:pPr>
+        <w:pStyle w:val="Normal"/>
+      </w:pPr>
+      <w:r>
+        <w:t xml:space="preserve">Certified in acupuncture, intravenous therapy, and intramuscular injection therapy</w:t>
+      </w:r>
+    </w:p>
+    <w:p>
+      <w:pPr>
+        <w:pStyle w:val="Heading3"/>
+      </w:pPr>
+      <w:r>
+        <w:t xml:space="preserve">Clinical Philosophy &amp; Approach</w:t>
+      </w:r>
+    </w:p>
+    <w:p>
+      <w:pPr>
+        <w:pStyle w:val="Normal"/>
+      </w:pPr>
+      <w:r>
+        <w:t xml:space="preserve">Dr. Thorne emphasizes individualized, evidence-informed care, recognizing that healthcare is not a one-size-fits-all approach. Her philosophy prioritizes:</w:t>
+      </w:r>
+    </w:p>
+    <w:p>
+      <w:pPr>
+        <w:pStyle w:val="Normal"/>
+      </w:pPr>
+      <w:r>
+        <w:t xml:space="preserve">Tailored treatment plans for each patient's unique circumstances</w:t>
+      </w:r>
+    </w:p>
+    <w:p>
+      <w:pPr>
+        <w:pStyle w:val="Normal"/>
+      </w:pPr>
+      <w:r>
+        <w:t xml:space="preserve">Evidence-informed naturopathic approaches</w:t>
+      </w:r>
+    </w:p>
+    <w:p>
+      <w:pPr>
+        <w:pStyle w:val="Normal"/>
+      </w:pPr>
+      <w:r>
+        <w:t xml:space="preserve">Comprehensive understanding of patient health history</w:t>
+      </w:r>
+    </w:p>
+    <w:p>
+      <w:pPr>
+        <w:pStyle w:val="Normal"/>
+      </w:pPr>
+      <w:r>
+        <w:t xml:space="preserve">Empowering patients through education</w:t>
+      </w:r>
+    </w:p>
+    <w:p>
+      <w:pPr>
+        <w:pStyle w:val="Heading3"/>
+      </w:pPr>
+      <w:r>
+        <w:t xml:space="preserve">Scope of Practice &amp; Areas of Focus</w:t>
+      </w:r>
+    </w:p>
+    <w:p>
+      <w:pPr>
+        <w:pStyle w:val="Heading3"/>
+      </w:pPr>
+      <w:r>
+        <w:t xml:space="preserve">(Non-diagnostic)</w:t>
+      </w:r>
+    </w:p>
+    <w:p>
+      <w:pPr>
+        <w:pStyle w:val="Normal"/>
+      </w:pPr>
+      <w:r>
+        <w:t xml:space="preserve">Dr. Thorne commonly supports:</w:t>
+      </w:r>
+    </w:p>
+    <w:p>
+      <w:pPr>
+        <w:pStyle w:val="Normal"/>
+      </w:pPr>
+      <w:r>
+        <w:t xml:space="preserve">Women's hormonal health concerns</w:t>
+      </w:r>
+    </w:p>
+    <w:p>
+      <w:pPr>
+        <w:pStyle w:val="Normal"/>
+      </w:pPr>
+      <w:r>
+        <w:t xml:space="preserve">General naturopathic medicine</w:t>
+      </w:r>
+    </w:p>
+    <w:p>
+      <w:pPr>
+        <w:pStyle w:val="Normal"/>
+      </w:pPr>
+      <w:r>
+        <w:t xml:space="preserve">Endocrine and metabolic support</w:t>
+      </w:r>
+    </w:p>
+    <w:p>
+      <w:pPr>
+        <w:pStyle w:val="Normal"/>
+      </w:pPr>
+      <w:r>
+        <w:t xml:space="preserve">Preventative and wellness-focused care</w:t>
+      </w:r>
+    </w:p>
+    <w:p>
+      <w:pPr>
+        <w:pStyle w:val="Heading3"/>
+      </w:pPr>
+      <w:r>
+        <w:t xml:space="preserve">Modalities Commonly Used</w:t>
+      </w:r>
+    </w:p>
+    <w:p>
+      <w:pPr>
+        <w:pStyle w:val="Normal"/>
+      </w:pPr>
+      <w:r>
+        <w:t xml:space="preserve">Naturopathic consultations and treatment plans</w:t>
+      </w:r>
+    </w:p>
+    <w:p>
+      <w:pPr>
+        <w:pStyle w:val="Normal"/>
+      </w:pPr>
+      <w:r>
+        <w:t xml:space="preserve">Acupuncture</w:t>
+      </w:r>
+    </w:p>
+    <w:p>
+      <w:pPr>
+        <w:pStyle w:val="Normal"/>
+      </w:pPr>
+      <w:r>
+        <w:t xml:space="preserve">IV nutrient therapy</w:t>
+      </w:r>
+    </w:p>
+    <w:p>
+      <w:pPr>
+        <w:pStyle w:val="Normal"/>
+      </w:pPr>
+      <w:r>
+        <w:t xml:space="preserve">Intramuscular injection therapy</w:t>
+      </w:r>
+    </w:p>
+    <w:p>
+      <w:pPr>
+        <w:pStyle w:val="Normal"/>
+      </w:pPr>
+      <w:r>
+        <w:t xml:space="preserve">Lifestyle and nutrition counseling</w:t>
+      </w:r>
+    </w:p>
+    <w:p>
+      <w:pPr>
+        <w:pStyle w:val="Heading3"/>
+      </w:pPr>
+      <w:r>
+        <w:t xml:space="preserve">Typical Patient Fit (Assistant Intelligence)</w:t>
+      </w:r>
+    </w:p>
+    <w:p>
+      <w:pPr>
+        <w:pStyle w:val="Normal"/>
+      </w:pPr>
+      <w:r>
+        <w:t xml:space="preserve">Patients who may prefer Dr. Thorne include:</w:t>
+      </w:r>
+    </w:p>
+    <w:p>
+      <w:pPr>
+        <w:pStyle w:val="Normal"/>
+      </w:pPr>
+      <w:r>
+        <w:t xml:space="preserve">Women seeking hormonal health support</w:t>
+      </w:r>
+    </w:p>
+    <w:p>
+      <w:pPr>
+        <w:pStyle w:val="Normal"/>
+      </w:pPr>
+      <w:r>
+        <w:t xml:space="preserve">Patients wanting individualized, evidence-informed care</w:t>
+      </w:r>
+    </w:p>
+    <w:p>
+      <w:pPr>
+        <w:pStyle w:val="Normal"/>
+      </w:pPr>
+      <w:r>
+        <w:t xml:space="preserve">Individuals seeking a holistic approach to general wellness</w:t>
+      </w:r>
+    </w:p>
+    <w:p>
+      <w:pPr>
+        <w:pStyle w:val="Normal"/>
+      </w:pPr>
+      <w:r>
+        <w:t xml:space="preserve">Patients interested in IV or injection therapies</w:t>
+      </w:r>
+    </w:p>
+    <w:p>
+      <w:pPr>
+        <w:pStyle w:val="Heading3"/>
+      </w:pPr>
+      <w:r>
+        <w:t xml:space="preserve">Appointment Types Offered</w:t>
+      </w:r>
+    </w:p>
+    <w:p>
+      <w:pPr>
+        <w:pStyle w:val="Normal"/>
+      </w:pPr>
+      <w:r>
+        <w:t xml:space="preserve">Initial Naturopathic Consultations</w:t>
+      </w:r>
+    </w:p>
+    <w:p>
+      <w:pPr>
+        <w:pStyle w:val="Normal"/>
+      </w:pPr>
+      <w:r>
+        <w:t xml:space="preserve">Follow-Up Naturopathic Appointments</w:t>
+      </w:r>
+    </w:p>
+    <w:p>
+      <w:pPr>
+        <w:pStyle w:val="Normal"/>
+      </w:pPr>
+      <w:r>
+        <w:t xml:space="preserve">Initial Injection/IV Consultations</w:t>
+      </w:r>
+    </w:p>
+    <w:p>
+      <w:pPr>
+        <w:pStyle w:val="Heading3"/>
+      </w:pPr>
+      <w:r>
+        <w:t xml:space="preserve">Booking Guidance (AI Use)</w:t>
+      </w:r>
+    </w:p>
+    <w:p>
+      <w:pPr>
+        <w:pStyle w:val="Normal"/>
+      </w:pPr>
+      <w:r>
+        <w:t xml:space="preserve">New patients → Initial Naturopathic Consultation</w:t>
+      </w:r>
+    </w:p>
+    <w:p>
+      <w:pPr>
+        <w:pStyle w:val="Normal"/>
+      </w:pPr>
+      <w:r>
+        <w:t xml:space="preserve">Returning patients → Follow-up appointment</w:t>
+      </w:r>
+    </w:p>
+    <w:p>
+      <w:pPr>
+        <w:pStyle w:val="Normal"/>
+      </w:pPr>
+      <w:r>
+        <w:t xml:space="preserve">IV/Injection interest → Initial Injection/IV Consultation</w:t>
+      </w:r>
+    </w:p>
+    <w:p>
+      <w:pPr>
+        <w:pStyle w:val="Heading2"/>
+      </w:pPr>
+      <w:r>
+        <w:t xml:space="preserve">6. PRACTITIONER: Emily Wilton, Dr. Acu, TCMD, RMT</w:t>
+      </w:r>
+    </w:p>
+    <w:p>
+      <w:pPr>
+        <w:pStyle w:val="Heading3"/>
+      </w:pPr>
+      <w:r>
+        <w:t xml:space="preserve">Professional Role</w:t>
+      </w:r>
+    </w:p>
+    <w:p>
+      <w:pPr>
+        <w:pStyle w:val="Normal"/>
+      </w:pPr>
+      <w:r>
+        <w:t xml:space="preserve">Emily Wilton is an Acupuncturist, Traditional Chinese Medicine Doctor, and Registered Massage Therapist at Nova Clinic, providing integrative manual and TCM-based therapies with more than eight years of clinical experience.</w:t>
+      </w:r>
+    </w:p>
+    <w:p>
+      <w:pPr>
+        <w:pStyle w:val="Heading3"/>
+      </w:pPr>
+      <w:r>
+        <w:t xml:space="preserve">Credentials &amp; Training</w:t>
+      </w:r>
+    </w:p>
+    <w:p>
+      <w:pPr>
+        <w:pStyle w:val="Normal"/>
+      </w:pPr>
+      <w:r>
+        <w:t xml:space="preserve">Doctor of Acupuncture (Dr. Acu)</w:t>
+      </w:r>
+    </w:p>
+    <w:p>
+      <w:pPr>
+        <w:pStyle w:val="Normal"/>
+      </w:pPr>
+      <w:r>
+        <w:t xml:space="preserve">Traditional Chinese Medicine Doctor (TCMD)</w:t>
+      </w:r>
+    </w:p>
+    <w:p>
+      <w:pPr>
+        <w:pStyle w:val="Normal"/>
+      </w:pPr>
+      <w:r>
+        <w:t xml:space="preserve">Registered Massage Therapist (RMT)</w:t>
+      </w:r>
+    </w:p>
+    <w:p>
+      <w:pPr>
+        <w:pStyle w:val="Normal"/>
+      </w:pPr>
+      <w:r>
+        <w:t xml:space="preserve">Certified in IASTM (Instrument-Assisted Soft Tissue Mobilization)</w:t>
+      </w:r>
+    </w:p>
+    <w:p>
+      <w:pPr>
+        <w:pStyle w:val="Normal"/>
+      </w:pPr>
+      <w:r>
+        <w:t xml:space="preserve">Trained in herbal medicine and cupping therapy</w:t>
+      </w:r>
+    </w:p>
+    <w:p>
+      <w:pPr>
+        <w:pStyle w:val="Normal"/>
+      </w:pPr>
+      <w:r>
+        <w:t xml:space="preserve">More than eight years of clinical experience</w:t>
+      </w:r>
+    </w:p>
+    <w:p>
+      <w:pPr>
+        <w:pStyle w:val="Heading3"/>
+      </w:pPr>
+      <w:r>
+        <w:t xml:space="preserve">Clinical Philosophy &amp; Approach</w:t>
+      </w:r>
+    </w:p>
+    <w:p>
+      <w:pPr>
+        <w:pStyle w:val="Normal"/>
+      </w:pPr>
+      <w:r>
+        <w:t xml:space="preserve">Emily employs a compassionate, whole-body approach to supporting chronic pain, chronic illness, and long-term wellbeing. Her methods integrate therapeutic massage, acupuncture, cupping, and gentle manual techniques designed to calm the nervous system and support natural healing.</w:t>
+      </w:r>
+    </w:p>
+    <w:p>
+      <w:pPr>
+        <w:pStyle w:val="Heading3"/>
+      </w:pPr>
+      <w:r>
+        <w:t xml:space="preserve">Scope of Practice &amp; Areas of Focus</w:t>
+      </w:r>
+    </w:p>
+    <w:p>
+      <w:pPr>
+        <w:pStyle w:val="Heading3"/>
+      </w:pPr>
+      <w:r>
+        <w:t xml:space="preserve">(Non-diagnostic)</w:t>
+      </w:r>
+    </w:p>
+    <w:p>
+      <w:pPr>
+        <w:pStyle w:val="Normal"/>
+      </w:pPr>
+      <w:r>
+        <w:t xml:space="preserve">Emily commonly supports:</w:t>
+      </w:r>
+    </w:p>
+    <w:p>
+      <w:pPr>
+        <w:pStyle w:val="Normal"/>
+      </w:pPr>
+      <w:r>
+        <w:t xml:space="preserve">Chronic pain and tension management</w:t>
+      </w:r>
+    </w:p>
+    <w:p>
+      <w:pPr>
+        <w:pStyle w:val="Normal"/>
+      </w:pPr>
+      <w:r>
+        <w:t xml:space="preserve">Chronic illness and systemic conditions</w:t>
+      </w:r>
+    </w:p>
+    <w:p>
+      <w:pPr>
+        <w:pStyle w:val="Normal"/>
+      </w:pPr>
+      <w:r>
+        <w:t xml:space="preserve">Nervous system regulation and stress-related pain</w:t>
+      </w:r>
+    </w:p>
+    <w:p>
+      <w:pPr>
+        <w:pStyle w:val="Normal"/>
+      </w:pPr>
+      <w:r>
+        <w:t xml:space="preserve">Mobility restoration and gentle movement support</w:t>
+      </w:r>
+    </w:p>
+    <w:p>
+      <w:pPr>
+        <w:pStyle w:val="Normal"/>
+      </w:pPr>
+      <w:r>
+        <w:t xml:space="preserve">Postural and alignment-focused care</w:t>
+      </w:r>
+    </w:p>
+    <w:p>
+      <w:pPr>
+        <w:pStyle w:val="Normal"/>
+      </w:pPr>
+      <w:r>
+        <w:t xml:space="preserve">Pre/post-surgical rehabilitation and scar tissue care</w:t>
+      </w:r>
+    </w:p>
+    <w:p>
+      <w:pPr>
+        <w:pStyle w:val="Heading3"/>
+      </w:pPr>
+      <w:r>
+        <w:t xml:space="preserve">Modalities Commonly Used</w:t>
+      </w:r>
+    </w:p>
+    <w:p>
+      <w:pPr>
+        <w:pStyle w:val="Normal"/>
+      </w:pPr>
+      <w:r>
+        <w:t xml:space="preserve">Therapeutic massage</w:t>
+      </w:r>
+    </w:p>
+    <w:p>
+      <w:pPr>
+        <w:pStyle w:val="Normal"/>
+      </w:pPr>
+      <w:r>
+        <w:t xml:space="preserve">Acupuncture</w:t>
+      </w:r>
+    </w:p>
+    <w:p>
+      <w:pPr>
+        <w:pStyle w:val="Normal"/>
+      </w:pPr>
+      <w:r>
+        <w:t xml:space="preserve">Cupping therapy</w:t>
+      </w:r>
+    </w:p>
+    <w:p>
+      <w:pPr>
+        <w:pStyle w:val="Normal"/>
+      </w:pPr>
+      <w:r>
+        <w:t xml:space="preserve">IASTM (Instrument-Assisted Soft Tissue Mobilization)</w:t>
+      </w:r>
+    </w:p>
+    <w:p>
+      <w:pPr>
+        <w:pStyle w:val="Normal"/>
+      </w:pPr>
+      <w:r>
+        <w:t xml:space="preserve">Traditional Chinese Medicine techniques</w:t>
+      </w:r>
+    </w:p>
+    <w:p>
+      <w:pPr>
+        <w:pStyle w:val="Normal"/>
+      </w:pPr>
+      <w:r>
+        <w:t xml:space="preserve">Herbal medicine</w:t>
+      </w:r>
+    </w:p>
+    <w:p>
+      <w:pPr>
+        <w:pStyle w:val="Heading3"/>
+      </w:pPr>
+      <w:r>
+        <w:t xml:space="preserve">Typical Patient Fit (Assistant Intelligence)</w:t>
+      </w:r>
+    </w:p>
+    <w:p>
+      <w:pPr>
+        <w:pStyle w:val="Normal"/>
+      </w:pPr>
+      <w:r>
+        <w:t xml:space="preserve">Patients who may prefer Emily include:</w:t>
+      </w:r>
+    </w:p>
+    <w:p>
+      <w:pPr>
+        <w:pStyle w:val="Normal"/>
+      </w:pPr>
+      <w:r>
+        <w:t xml:space="preserve">Individuals dealing with chronic pain or tension</w:t>
+      </w:r>
+    </w:p>
+    <w:p>
+      <w:pPr>
+        <w:pStyle w:val="Normal"/>
+      </w:pPr>
+      <w:r>
+        <w:t xml:space="preserve">Patients recovering from surgery or injury</w:t>
+      </w:r>
+    </w:p>
+    <w:p>
+      <w:pPr>
+        <w:pStyle w:val="Normal"/>
+      </w:pPr>
+      <w:r>
+        <w:t xml:space="preserve">People seeking nervous system regulation and stress relief</w:t>
+      </w:r>
+    </w:p>
+    <w:p>
+      <w:pPr>
+        <w:pStyle w:val="Normal"/>
+      </w:pPr>
+      <w:r>
+        <w:t xml:space="preserve">Those wanting a compassionate, whole-body approach</w:t>
+      </w:r>
+    </w:p>
+    <w:p>
+      <w:pPr>
+        <w:pStyle w:val="Heading3"/>
+      </w:pPr>
+      <w:r>
+        <w:t xml:space="preserve">Appointment Types Offered</w:t>
+      </w:r>
+    </w:p>
+    <w:p>
+      <w:pPr>
+        <w:pStyle w:val="Normal"/>
+      </w:pPr>
+      <w:r>
+        <w:t xml:space="preserve">Acupuncture sessions (initial &amp; follow-up)</w:t>
+      </w:r>
+    </w:p>
+    <w:p>
+      <w:pPr>
+        <w:pStyle w:val="Normal"/>
+      </w:pPr>
+      <w:r>
+        <w:t xml:space="preserve">Cupping sessions</w:t>
+      </w:r>
+    </w:p>
+    <w:p>
+      <w:pPr>
+        <w:pStyle w:val="Normal"/>
+      </w:pPr>
+      <w:r>
+        <w:t xml:space="preserve">Massage Therapy sessions (30, 60, 90 minutes)</w:t>
+      </w:r>
+    </w:p>
+    <w:p>
+      <w:pPr>
+        <w:pStyle w:val="Normal"/>
+      </w:pPr>
+      <w:r>
+        <w:t xml:space="preserve">Combined Massage + Acupuncture sessions</w:t>
+      </w:r>
+    </w:p>
+    <w:p>
+      <w:pPr>
+        <w:pStyle w:val="Heading3"/>
+      </w:pPr>
+      <w:r>
+        <w:t xml:space="preserve">Booking Guidance (AI Use)</w:t>
+      </w:r>
+    </w:p>
+    <w:p>
+      <w:pPr>
+        <w:pStyle w:val="Normal"/>
+      </w:pPr>
+      <w:r>
+        <w:t xml:space="preserve">Acupuncture patients → Acupuncture appointment</w:t>
+      </w:r>
+    </w:p>
+    <w:p>
+      <w:pPr>
+        <w:pStyle w:val="Normal"/>
+      </w:pPr>
+      <w:r>
+        <w:t xml:space="preserve">Massage patients → Massage Therapy appointment</w:t>
+      </w:r>
+    </w:p>
+    <w:p>
+      <w:pPr>
+        <w:pStyle w:val="Normal"/>
+      </w:pPr>
+      <w:r>
+        <w:t xml:space="preserve">Combined session → Combined Massage + Acupuncture</w:t>
       </w:r>
     </w:p>
     <w:p>

</xml_diff>